<commit_message>
Alinear Fase 1 y agregar informes individuales
</commit_message>
<xml_diff>
--- a/FASE 1/EVIDENCIAS_GRUPALES/FIX_AND_GO_Fase_1_MVP_reformulado.docx
+++ b/FASE 1/EVIDENCIAS_GRUPALES/FIX_AND_GO_Fase_1_MVP_reformulado.docx
@@ -628,7 +628,7 @@
           <w:sz w:val="21"/>
           <w:szCs w:val="21"/>
         </w:rPr>
-        <w:t xml:space="preserve">Se conserva la idea de conectar clientes con profesionales de gas, electricidad y agua mediante información comparable y trazabilidad. El MVP será una aplicación web adaptable a computadores y teléfonos. Una aplicación nativa, la expansión a otros rubros y la operación comercial se consideran etapas posteriores.</w:t>
+        <w:t>Se conserva la idea de conectar clientes con profesionales de gas, electricidad y agua mediante información comparable y trazabilidad. El MVP será una aplicación web adaptable a computadores y teléfonos. Una publicación en tiendas de aplicaciones, la expansión a otros rubros y la operación comercial se consideran etapas posteriores.</w:t>
       </w:r>
     </w:p>
     <w:p>
@@ -744,7 +744,7 @@
           <w:sz w:val="21"/>
           <w:szCs w:val="21"/>
         </w:rPr>
-        <w:t xml:space="preserve">El MVP incluirá acceso de demostración por rol, perfiles ficticios, búsqueda por categoría y zona de prueba, solicitud, cotización, aceptación, seguimiento y valoración al cierre. Cliente, profesional y administrador tendrán acciones diferenciadas. La interfaz responsive cubrirá uso web y móvil desde una misma base. La verificación, ubicación, mensajes y pago se mostrarán como simulaciones; no se integrarán cobros reales ni se requerirán credenciales institucionales.</w:t>
+        <w:t>El MVP incluirá acceso de demostración por rol, perfiles ficticios, búsqueda por categoría y zona de prueba, solicitud, cotización, aceptación, seguimiento y valoración al cierre. Cliente y prestador tendrán acciones diferenciadas, mientras Django Admin cubrirá la gestión interna del equipo. La interfaz móvil se ejecutará en iOS y Android mediante React Native con Expo. La verificación, ubicación, mensajes y pago se mostrarán como simulaciones; no se integrarán cobros reales ni se requerirán credenciales institucionales.</w:t>
       </w:r>
     </w:p>
     <w:p>
@@ -1039,7 +1039,7 @@
           <w:sz w:val="21"/>
           <w:szCs w:val="21"/>
         </w:rPr>
-        <w:t xml:space="preserve">La factibilidad se basa en una aplicación web responsive, un backend modular y una base de datos de demostración. Se propone TypeScript para la interfaz y el servidor, y una base relacional; la selección se documentará antes de implementar. El entorno local será suficiente para presentar. Se requieren permisos por rol, validaciones, control de estados y pruebas del flujo; los respaldos y la nube productiva quedan fuera de esta fase.</w:t>
+        <w:t>La factibilidad se basa en una aplicación móvil para iOS y Android, una API monolítica y una base de datos de demostración. Se propone React Native con Expo y TypeScript para la aplicación, Django REST Framework para la API y SQLite local. La configuración se documentará antes de implementar. El entorno local será suficiente para presentar. Se requieren permisos por rol, validaciones, control de estados y pruebas del flujo; los respaldos y la nube productiva quedan fuera de esta fase.</w:t>
       </w:r>
     </w:p>
     <w:p>
@@ -1222,7 +1222,7 @@
           <w:sz w:val="21"/>
           <w:szCs w:val="21"/>
         </w:rPr>
-        <w:t xml:space="preserve">Incluye gas, electricidad y agua; perfiles, búsqueda, solicitudes, cotizaciones, estados y valoración. Se usará una web responsive con roles y datos ficticios. Excluye pagos reales, validación oficial de credenciales, aplicación nativa, expansión comercial y servicios de gran escala.</w:t>
+        <w:t>Incluye gas, electricidad y agua; perfiles, búsqueda, solicitudes, cotizaciones, estados y valoración. Se usará una aplicación móvil para iOS y Android, con roles y datos ficticios. Excluye pagos reales, validación oficial de credenciales, publicación en tiendas de aplicaciones, expansión comercial y servicios de gran escala.</w:t>
       </w:r>
     </w:p>
     <w:p>
@@ -1814,7 +1814,7 @@
           <w:sz w:val="21"/>
           <w:szCs w:val="21"/>
         </w:rPr>
-        <w:t xml:space="preserve">Aportes en especie: 3 integrantes × 8 horas semanales × 18 semanas = 432 horas-persona estimadas. No son horas ya ejecutadas ni remuneraciones; equivalen a tiempo de trabajo del equipo, no a un desembolso monetario.</w:t>
+        <w:t>Para Benjamín se estiman 6 horas semanales flexibles entre S5 y S15: 66 horas brutas, aproximadamente 56 planificadas y 10 de reserva. Daniel y Felipe distribuirán sus tareas de documentación y pruebas según el calendario semanal. Estas horas representan dedicación académica y no un desembolso monetario.</w:t>
       </w:r>
     </w:p>
     <w:p>
@@ -2324,16 +2324,15 @@
           <w:sz w:val="21"/>
           <w:szCs w:val="21"/>
         </w:rPr>
-        <w:t xml:space="preserve">Asignación propuesta: </w:t>
-      </w:r>
-      <w:r>
-        <w:rPr>
-          <w:rFonts w:ascii="Calibri" w:cs="Calibri" w:eastAsia="Calibri" w:hAnsi="Calibri"/>
-          <w:color w:val="2B2B2B"/>
-          <w:sz w:val="21"/>
-          <w:szCs w:val="21"/>
-        </w:rPr>
-        <w:t xml:space="preserve">Benjamín Olmedo lidera prototipado, interfaz responsive, accesibilidad y pruebas de tareas. Daniel Baeza lidera backend, permisos y transiciones de solicitudes. Felipe Arce lidera modelo de datos, datos de prueba y consolidación de pruebas e informe. Los tres revisan e integran los entregables. Esta distribución es una propuesta de planificación, no un acuerdo ya acreditado.</w:t>
+        <w:t>Asignación acordada: Benjamín Olmedo desarrolla la aplicación móvil, la API Django, la base de datos, la integración, Docker y las pruebas automatizadas. Daniel Baeza mantiene requisitos, backlog, planificación, documentación e informes. Felipe Arce prepara datos de prueba, ejecuta pruebas manuales en iOS y Android y consolida capturas, resultados y evidencia audiovisual. Los tres revisan los entregables antes de cada hito.</w:t>
+      </w:r>
+      <w:r>
+        <w:rPr>
+          <w:rFonts w:ascii="Calibri" w:cs="Calibri" w:eastAsia="Calibri" w:hAnsi="Calibri"/>
+          <w:color w:val="2B2B2B"/>
+          <w:sz w:val="21"/>
+          <w:szCs w:val="21"/>
+        </w:rPr>
       </w:r>
     </w:p>
     <w:p>
@@ -2754,7 +2753,7 @@
                 <w:sz w:val="19"/>
                 <w:szCs w:val="19"/>
               </w:rPr>
-              <w:t xml:space="preserve">Ajustar objetivos y plan; prototipo y arquitectura inicial. Benjamín: pantallas; Daniel: contratos; Felipe: datos. Recursos: entorno local y datos ficticios. Evidencia: versión revisada, prototipo y modelo. Esta actualización se sitúa en semana 5.</w:t>
+              <w:t>Ajustar objetivos y plan; prototipo y arquitectura inicial. Benjamín: prototipo y arquitectura técnica; Daniel: requisitos y planificación; Felipe: datos de prueba y casos manuales. Recursos: entorno local y datos ficticios. Evidencia: versión revisada, prototipo y modelo. Esta actualización se sitúa en semana 5.</w:t>
             </w:r>
           </w:p>
         </w:tc>
@@ -3021,7 +3020,7 @@
                 <w:sz w:val="19"/>
                 <w:szCs w:val="19"/>
               </w:rPr>
-              <w:t xml:space="preserve">Ejecutar pruebas funcionales y sesiones con usuarios; corregir errores y revisar accesibilidad. Benjamín coordina tareas UX; Daniel y Felipe corrigen e integran. Evidencia: resultados, capturas y trazabilidad. Riesgo: disponibilidad de participantes.</w:t>
+              <w:t>Ejecutar pruebas funcionales y sesiones con usuarios; corregir errores y revisar accesibilidad. Benjamín corrige la aplicación; Daniel actualiza documentación y decisiones; Felipe repite pruebas y registra resultados. Evidencia: resultados, capturas y trazabilidad. Riesgo: disponibilidad de participantes.</w:t>
             </w:r>
           </w:p>
         </w:tc>

</xml_diff>